<commit_message>
docs: update student credentials to SIRIN J DEVASSIA (Roll 28, RAI)
</commit_message>
<xml_diff>
--- a/Micro_Project_3DOF_Robotic_Manipulator.docx
+++ b/Micro_Project_3DOF_Robotic_Manipulator.docx
@@ -107,7 +107,7 @@
                 <w:color w:val="2D3748"/>
                 <w:sz w:val="21"/>
               </w:rPr>
-              <w:t>Group Members:</w:t>
+              <w:t>Student Name:</w:t>
             </w:r>
           </w:p>
         </w:tc>
@@ -128,11 +128,7 @@
                 <w:color w:val="2D3748"/>
                 <w:sz w:val="21"/>
               </w:rPr>
-              <w:t>1. [Student Name 1] - [Roll Number / ID]</w:t>
-              <w:br/>
-              <w:t>2. [Student Name 2] - [Roll Number / ID]</w:t>
-              <w:br/>
-              <w:t>3. [Student Name 3] - [Roll Number / ID]</w:t>
+              <w:t>SIRIN J DEVASSIA</w:t>
             </w:r>
           </w:p>
         </w:tc>
@@ -155,7 +151,7 @@
                 <w:color w:val="2D3748"/>
                 <w:sz w:val="21"/>
               </w:rPr>
-              <w:t>Department:</w:t>
+              <w:t>Roll No:</w:t>
             </w:r>
           </w:p>
         </w:tc>
@@ -176,7 +172,7 @@
                 <w:color w:val="2D3748"/>
                 <w:sz w:val="21"/>
               </w:rPr>
-              <w:t>[Department Name, e.g., Mechanical / Robotics / Mechatronics]</w:t>
+              <w:t>28</w:t>
             </w:r>
           </w:p>
         </w:tc>
@@ -199,7 +195,7 @@
                 <w:color w:val="2D3748"/>
                 <w:sz w:val="21"/>
               </w:rPr>
-              <w:t>Institution:</w:t>
+              <w:t>Department:</w:t>
             </w:r>
           </w:p>
         </w:tc>
@@ -220,7 +216,7 @@
                 <w:color w:val="2D3748"/>
                 <w:sz w:val="21"/>
               </w:rPr>
-              <w:t>[College / University Name]</w:t>
+              <w:t>Robotics and Artificial Intelligence (RAI)</w:t>
             </w:r>
           </w:p>
         </w:tc>

</xml_diff>